<commit_message>
feat: FASE 1 - Rebrand para INVLAB | Identidade visual profissional Fintech | Tema azul corporativo, disclaimers legais, pagina metodologia
</commit_message>
<xml_diff>
--- a/ROBOS_Codigos_Financeiros/DIcas_Robos.docx
+++ b/ROBOS_Codigos_Financeiros/DIcas_Robos.docx
@@ -355,6 +355,21 @@
     <w:p>
       <w:pPr>
         <w:spacing w:after="0" w:line="240" w:lineRule="auto"/>
+      </w:pPr>
+    </w:p>
+    <w:p>
+      <w:pPr>
+        <w:spacing w:after="0" w:line="240" w:lineRule="auto"/>
+      </w:pPr>
+    </w:p>
+    <w:p>
+      <w:pPr>
+        <w:spacing w:after="0" w:line="240" w:lineRule="auto"/>
+      </w:pPr>
+    </w:p>
+    <w:p>
+      <w:pPr>
+        <w:spacing w:after="0" w:line="240" w:lineRule="auto"/>
         <w:rPr>
           <w:b/>
           <w:bCs/>
@@ -449,7 +464,7 @@
       </w:pPr>
       <w:r>
         <w:pict w14:anchorId="03A2DA77">
-          <v:rect id="_x0000_i1079" style="width:0;height:.75pt" o:hralign="center" o:hrstd="t" o:hr="t" fillcolor="#a0a0a0" stroked="f"/>
+          <v:rect id="_x0000_i1025" style="width:0;height:.75pt" o:hralign="center" o:hrstd="t" o:hr="t" fillcolor="#a0a0a0" stroked="f"/>
         </w:pict>
       </w:r>
     </w:p>
@@ -590,6 +605,7 @@
         <w:spacing w:after="0" w:line="240" w:lineRule="auto"/>
       </w:pPr>
       <w:r>
+        <w:lastRenderedPageBreak/>
         <w:t>Exemplo:</w:t>
       </w:r>
     </w:p>
@@ -622,7 +638,6 @@
           <w:b/>
           <w:bCs/>
         </w:rPr>
-        <w:lastRenderedPageBreak/>
         <w:t>5. "Robô de Rebalanceamento Automático"</w:t>
       </w:r>
     </w:p>
@@ -790,7 +805,7 @@
       </w:pPr>
       <w:r>
         <w:pict w14:anchorId="19A3C50D">
-          <v:rect id="_x0000_i1080" style="width:0;height:.75pt" o:hralign="center" o:hrstd="t" o:hr="t" fillcolor="#a0a0a0" stroked="f"/>
+          <v:rect id="_x0000_i1026" style="width:0;height:.75pt" o:hralign="center" o:hrstd="t" o:hr="t" fillcolor="#a0a0a0" stroked="f"/>
         </w:pict>
       </w:r>
     </w:p>
@@ -998,7 +1013,7 @@
       </w:pPr>
       <w:r>
         <w:pict w14:anchorId="3ACB3194">
-          <v:rect id="_x0000_i1081" style="width:0;height:.75pt" o:hralign="center" o:hrstd="t" o:hr="t" fillcolor="#a0a0a0" stroked="f"/>
+          <v:rect id="_x0000_i1027" style="width:0;height:.75pt" o:hralign="center" o:hrstd="t" o:hr="t" fillcolor="#a0a0a0" stroked="f"/>
         </w:pict>
       </w:r>
     </w:p>
@@ -1146,6 +1161,7 @@
       </w:pPr>
       <w:proofErr w:type="spellStart"/>
       <w:r>
+        <w:lastRenderedPageBreak/>
         <w:t>text</w:t>
       </w:r>
       <w:proofErr w:type="spellEnd"/>
@@ -1187,40 +1203,559 @@
         <w:spacing w:after="0" w:line="240" w:lineRule="auto"/>
       </w:pPr>
       <w:r>
+        <w:t>→ Ganho compartilhado</w:t>
+      </w:r>
+    </w:p>
+    <w:p>
+      <w:pPr>
+        <w:spacing w:after="0" w:line="240" w:lineRule="auto"/>
+        <w:rPr>
+          <w:b/>
+          <w:bCs/>
+        </w:rPr>
+      </w:pPr>
+      <w:r>
+        <w:rPr>
+          <w:b/>
+          <w:bCs/>
+        </w:rPr>
+        <w:t xml:space="preserve">Estratégia 3: "White </w:t>
+      </w:r>
+      <w:proofErr w:type="spellStart"/>
+      <w:r>
+        <w:rPr>
+          <w:b/>
+          <w:bCs/>
+        </w:rPr>
+        <w:t>Label</w:t>
+      </w:r>
+      <w:proofErr w:type="spellEnd"/>
+      <w:r>
+        <w:rPr>
+          <w:b/>
+          <w:bCs/>
+        </w:rPr>
+        <w:t>"</w:t>
+      </w:r>
+    </w:p>
+    <w:p>
+      <w:pPr>
+        <w:spacing w:after="0" w:line="240" w:lineRule="auto"/>
+      </w:pPr>
+      <w:proofErr w:type="spellStart"/>
+      <w:r>
+        <w:t>text</w:t>
+      </w:r>
+      <w:proofErr w:type="spellEnd"/>
+    </w:p>
+    <w:p>
+      <w:pPr>
+        <w:spacing w:after="0" w:line="240" w:lineRule="auto"/>
+      </w:pPr>
+      <w:r>
+        <w:t>Sua tecnologia, marca deles</w:t>
+      </w:r>
+    </w:p>
+    <w:p>
+      <w:pPr>
+        <w:spacing w:after="0" w:line="240" w:lineRule="auto"/>
+      </w:pPr>
+      <w:r>
+        <w:t>Valor: R$ 5.000-50.000/mês por empresa</w:t>
+      </w:r>
+    </w:p>
+    <w:p>
+      <w:pPr>
+        <w:spacing w:after="0" w:line="240" w:lineRule="auto"/>
+      </w:pPr>
+      <w:r>
+        <w:pict w14:anchorId="2039DAE7">
+          <v:rect id="_x0000_i1028" style="width:0;height:.75pt" o:hralign="center" o:hrstd="t" o:hr="t" fillcolor="#a0a0a0" stroked="f"/>
+        </w:pict>
+      </w:r>
+    </w:p>
+    <w:p>
+      <w:pPr>
+        <w:spacing w:after="0" w:line="240" w:lineRule="auto"/>
+        <w:rPr>
+          <w:b/>
+          <w:bCs/>
+        </w:rPr>
+      </w:pPr>
+      <w:r>
+        <w:rPr>
+          <w:rFonts w:ascii="Segoe UI Emoji" w:hAnsi="Segoe UI Emoji" w:cs="Segoe UI Emoji"/>
+          <w:b/>
+          <w:bCs/>
+        </w:rPr>
+        <w:t>🎯</w:t>
+      </w:r>
+      <w:r>
+        <w:rPr>
+          <w:b/>
+          <w:bCs/>
+        </w:rPr>
+        <w:t> ROBÔS MAIS VENDÁVEIS POR SEGMENTO:</w:t>
+      </w:r>
+    </w:p>
+    <w:p>
+      <w:pPr>
+        <w:spacing w:after="0" w:line="240" w:lineRule="auto"/>
+        <w:rPr>
+          <w:b/>
+          <w:bCs/>
+        </w:rPr>
+      </w:pPr>
+      <w:r>
+        <w:rPr>
+          <w:b/>
+          <w:bCs/>
+        </w:rPr>
+        <w:t>Para Corretoras:</w:t>
+      </w:r>
+    </w:p>
+    <w:p>
+      <w:pPr>
+        <w:spacing w:after="0" w:line="240" w:lineRule="auto"/>
+      </w:pPr>
+      <w:proofErr w:type="spellStart"/>
+      <w:r>
+        <w:t>text</w:t>
+      </w:r>
+      <w:proofErr w:type="spellEnd"/>
+    </w:p>
+    <w:p>
+      <w:pPr>
+        <w:spacing w:after="0" w:line="240" w:lineRule="auto"/>
+      </w:pPr>
+      <w:r>
+        <w:rPr>
+          <w:rFonts w:ascii="Segoe UI Emoji" w:hAnsi="Segoe UI Emoji" w:cs="Segoe UI Emoji"/>
+        </w:rPr>
+        <w:t>🥇</w:t>
+      </w:r>
+      <w:r>
+        <w:t xml:space="preserve"> #1: Simulador de Investimentos Personalizado</w:t>
+      </w:r>
+    </w:p>
+    <w:p>
+      <w:pPr>
+        <w:spacing w:after="0" w:line="240" w:lineRule="auto"/>
+      </w:pPr>
+      <w:r>
+        <w:rPr>
+          <w:rFonts w:ascii="Segoe UI Emoji" w:hAnsi="Segoe UI Emoji" w:cs="Segoe UI Emoji"/>
+        </w:rPr>
+        <w:t>🥈</w:t>
+      </w:r>
+      <w:r>
+        <w:t xml:space="preserve"> #2: Alertas Inteligentes de Carteira  </w:t>
+      </w:r>
+    </w:p>
+    <w:p>
+      <w:pPr>
+        <w:spacing w:after="0" w:line="240" w:lineRule="auto"/>
+      </w:pPr>
+      <w:r>
+        <w:rPr>
+          <w:rFonts w:ascii="Segoe UI Emoji" w:hAnsi="Segoe UI Emoji" w:cs="Segoe UI Emoji"/>
+        </w:rPr>
+        <w:t>🥉</w:t>
+      </w:r>
+      <w:r>
+        <w:t xml:space="preserve"> #3: Comparador de Taxas</w:t>
+      </w:r>
+    </w:p>
+    <w:p>
+      <w:pPr>
+        <w:spacing w:after="0" w:line="240" w:lineRule="auto"/>
+        <w:rPr>
+          <w:b/>
+          <w:bCs/>
+        </w:rPr>
+      </w:pPr>
+      <w:r>
+        <w:rPr>
+          <w:b/>
+          <w:bCs/>
+        </w:rPr>
+        <w:t>Para Bancos:</w:t>
+      </w:r>
+    </w:p>
+    <w:p>
+      <w:pPr>
+        <w:spacing w:after="0" w:line="240" w:lineRule="auto"/>
+      </w:pPr>
+      <w:proofErr w:type="spellStart"/>
+      <w:r>
+        <w:t>text</w:t>
+      </w:r>
+      <w:proofErr w:type="spellEnd"/>
+    </w:p>
+    <w:p>
+      <w:pPr>
+        <w:spacing w:after="0" w:line="240" w:lineRule="auto"/>
+      </w:pPr>
+      <w:r>
+        <w:rPr>
+          <w:rFonts w:ascii="Segoe UI Emoji" w:hAnsi="Segoe UI Emoji" w:cs="Segoe UI Emoji"/>
+        </w:rPr>
+        <w:t>🥇</w:t>
+      </w:r>
+      <w:r>
+        <w:t xml:space="preserve"> #1: Robô de Educação Financeira Gamificada</w:t>
+      </w:r>
+    </w:p>
+    <w:p>
+      <w:pPr>
+        <w:spacing w:after="0" w:line="240" w:lineRule="auto"/>
+      </w:pPr>
+      <w:r>
+        <w:rPr>
+          <w:rFonts w:ascii="Segoe UI Emoji" w:hAnsi="Segoe UI Emoji" w:cs="Segoe UI Emoji"/>
+        </w:rPr>
+        <w:t>🥈</w:t>
+      </w:r>
+      <w:r>
+        <w:t xml:space="preserve"> #2: Analisador de Perfil Comportamental</w:t>
+      </w:r>
+    </w:p>
+    <w:p>
+      <w:pPr>
+        <w:spacing w:after="0" w:line="240" w:lineRule="auto"/>
+      </w:pPr>
+      <w:r>
+        <w:rPr>
+          <w:rFonts w:ascii="Segoe UI Emoji" w:hAnsi="Segoe UI Emoji" w:cs="Segoe UI Emoji"/>
+        </w:rPr>
+        <w:t>🥉</w:t>
+      </w:r>
+      <w:r>
+        <w:t xml:space="preserve"> #3: Sugestor de Produtos Cruzados</w:t>
+      </w:r>
+    </w:p>
+    <w:p>
+      <w:pPr>
+        <w:spacing w:after="0" w:line="240" w:lineRule="auto"/>
+        <w:rPr>
+          <w:b/>
+          <w:bCs/>
+        </w:rPr>
+      </w:pPr>
+      <w:r>
+        <w:rPr>
+          <w:b/>
+          <w:bCs/>
+        </w:rPr>
+        <w:t>Para Fintechs:</w:t>
+      </w:r>
+    </w:p>
+    <w:p>
+      <w:pPr>
+        <w:spacing w:after="0" w:line="240" w:lineRule="auto"/>
+      </w:pPr>
+      <w:proofErr w:type="spellStart"/>
+      <w:r>
+        <w:t>text</w:t>
+      </w:r>
+      <w:proofErr w:type="spellEnd"/>
+    </w:p>
+    <w:p>
+      <w:pPr>
+        <w:spacing w:after="0" w:line="240" w:lineRule="auto"/>
+      </w:pPr>
+      <w:r>
+        <w:rPr>
+          <w:rFonts w:ascii="Segoe UI Emoji" w:hAnsi="Segoe UI Emoji" w:cs="Segoe UI Emoji"/>
+        </w:rPr>
+        <w:t>🥇</w:t>
+      </w:r>
+      <w:r>
+        <w:t xml:space="preserve"> #1: Comparador de Taxas em Tempo Real</w:t>
+      </w:r>
+    </w:p>
+    <w:p>
+      <w:pPr>
+        <w:spacing w:after="0" w:line="240" w:lineRule="auto"/>
+      </w:pPr>
+      <w:r>
+        <w:rPr>
+          <w:rFonts w:ascii="Segoe UI Emoji" w:hAnsi="Segoe UI Emoji" w:cs="Segoe UI Emoji"/>
+        </w:rPr>
+        <w:t>🥈</w:t>
+      </w:r>
+      <w:r>
+        <w:t xml:space="preserve"> #2: Alertas Inteligentes</w:t>
+      </w:r>
+    </w:p>
+    <w:p>
+      <w:pPr>
+        <w:spacing w:after="0" w:line="240" w:lineRule="auto"/>
+      </w:pPr>
+      <w:r>
+        <w:rPr>
+          <w:rFonts w:ascii="Segoe UI Emoji" w:hAnsi="Segoe UI Emoji" w:cs="Segoe UI Emoji"/>
+        </w:rPr>
+        <w:t>🥉</w:t>
+      </w:r>
+      <w:r>
+        <w:t xml:space="preserve"> #3: Robô de Prevenção de Inadimplência</w:t>
+      </w:r>
+    </w:p>
+    <w:p>
+      <w:pPr>
+        <w:spacing w:after="0" w:line="240" w:lineRule="auto"/>
+      </w:pPr>
+      <w:r>
+        <w:pict w14:anchorId="668F851D">
+          <v:rect id="_x0000_i1029" style="width:0;height:.75pt" o:hralign="center" o:hrstd="t" o:hr="t" fillcolor="#a0a0a0" stroked="f"/>
+        </w:pict>
+      </w:r>
+    </w:p>
+    <w:p>
+      <w:pPr>
+        <w:spacing w:after="0" w:line="240" w:lineRule="auto"/>
+        <w:rPr>
+          <w:b/>
+          <w:bCs/>
+        </w:rPr>
+      </w:pPr>
+      <w:r>
+        <w:rPr>
+          <w:rFonts w:ascii="Segoe UI Emoji" w:hAnsi="Segoe UI Emoji" w:cs="Segoe UI Emoji"/>
+          <w:b/>
+          <w:bCs/>
+        </w:rPr>
+        <w:t>🚀</w:t>
+      </w:r>
+      <w:r>
+        <w:rPr>
+          <w:b/>
+          <w:bCs/>
+        </w:rPr>
+        <w:t> ROADMAP DE VENDAS B2B:</w:t>
+      </w:r>
+    </w:p>
+    <w:p>
+      <w:pPr>
+        <w:spacing w:after="0" w:line="240" w:lineRule="auto"/>
+        <w:rPr>
+          <w:b/>
+          <w:bCs/>
+        </w:rPr>
+      </w:pPr>
+      <w:r>
+        <w:rPr>
+          <w:b/>
+          <w:bCs/>
+        </w:rPr>
+        <w:t>Fase 1 - Validação (30 dias)</w:t>
+      </w:r>
+    </w:p>
+    <w:p>
+      <w:pPr>
+        <w:spacing w:after="0" w:line="240" w:lineRule="auto"/>
+      </w:pPr>
+      <w:proofErr w:type="spellStart"/>
+      <w:r>
+        <w:t>text</w:t>
+      </w:r>
+      <w:proofErr w:type="spellEnd"/>
+    </w:p>
+    <w:p>
+      <w:pPr>
+        <w:spacing w:after="0" w:line="240" w:lineRule="auto"/>
+      </w:pPr>
+      <w:r>
+        <w:t>1. Desenvolver 1 robô completo (Simulador)</w:t>
+      </w:r>
+    </w:p>
+    <w:p>
+      <w:pPr>
+        <w:spacing w:after="0" w:line="240" w:lineRule="auto"/>
+      </w:pPr>
+      <w:r>
+        <w:t>2. Oferecer GRÁTIS para 5 corretoras pequenas</w:t>
+      </w:r>
+    </w:p>
+    <w:p>
+      <w:pPr>
+        <w:spacing w:after="0" w:line="240" w:lineRule="auto"/>
+      </w:pPr>
+      <w:r>
+        <w:t>3. Coletar depoimentos e métricas</w:t>
+      </w:r>
+    </w:p>
+    <w:p>
+      <w:pPr>
+        <w:spacing w:after="0" w:line="240" w:lineRule="auto"/>
+      </w:pPr>
+      <w:r>
+        <w:t>4. Refinar produto</w:t>
+      </w:r>
+    </w:p>
+    <w:p>
+      <w:pPr>
+        <w:spacing w:after="0" w:line="240" w:lineRule="auto"/>
+        <w:rPr>
+          <w:b/>
+          <w:bCs/>
+        </w:rPr>
+      </w:pPr>
+      <w:r>
+        <w:rPr>
+          <w:b/>
+          <w:bCs/>
+        </w:rPr>
+        <w:t>Fase 2 - Tração (90 dias)</w:t>
+      </w:r>
+    </w:p>
+    <w:p>
+      <w:pPr>
+        <w:spacing w:after="0" w:line="240" w:lineRule="auto"/>
+      </w:pPr>
+      <w:proofErr w:type="spellStart"/>
+      <w:r>
+        <w:t>text</w:t>
+      </w:r>
+      <w:proofErr w:type="spellEnd"/>
+    </w:p>
+    <w:p>
+      <w:pPr>
+        <w:spacing w:after="0" w:line="240" w:lineRule="auto"/>
+      </w:pPr>
+      <w:r>
+        <w:t>1. Buscar 10-20 corretoras médias (R$ 1.000-5.000/mês)</w:t>
+      </w:r>
+    </w:p>
+    <w:p>
+      <w:pPr>
+        <w:spacing w:after="0" w:line="240" w:lineRule="auto"/>
+      </w:pPr>
+      <w:r>
+        <w:t>2. Desenvolver 2º robô (Alertas)</w:t>
+      </w:r>
+    </w:p>
+    <w:p>
+      <w:pPr>
+        <w:spacing w:after="0" w:line="240" w:lineRule="auto"/>
+      </w:pPr>
+      <w:r>
+        <w:t xml:space="preserve">3. Criar case </w:t>
+      </w:r>
+      <w:proofErr w:type="spellStart"/>
+      <w:r>
+        <w:t>studies</w:t>
+      </w:r>
+      <w:proofErr w:type="spellEnd"/>
+    </w:p>
+    <w:p>
+      <w:pPr>
+        <w:spacing w:after="0" w:line="240" w:lineRule="auto"/>
+      </w:pPr>
+      <w:r>
+        <w:t>4. Participar de eventos do setor</w:t>
+      </w:r>
+    </w:p>
+    <w:p>
+      <w:pPr>
+        <w:spacing w:after="0" w:line="240" w:lineRule="auto"/>
+        <w:rPr>
+          <w:b/>
+          <w:bCs/>
+        </w:rPr>
+      </w:pPr>
+      <w:r>
+        <w:rPr>
+          <w:b/>
+          <w:bCs/>
+        </w:rPr>
+        <w:t>Fase 3 - Escala (6 meses+)</w:t>
+      </w:r>
+    </w:p>
+    <w:p>
+      <w:pPr>
+        <w:spacing w:after="0" w:line="240" w:lineRule="auto"/>
+      </w:pPr>
+      <w:proofErr w:type="spellStart"/>
+      <w:r>
+        <w:t>text</w:t>
+      </w:r>
+      <w:proofErr w:type="spellEnd"/>
+    </w:p>
+    <w:p>
+      <w:pPr>
+        <w:spacing w:after="0" w:line="240" w:lineRule="auto"/>
+      </w:pPr>
+      <w:r>
+        <w:t>1. Atacar grandes bancos/corretoras (R$ 10.000+/mês)</w:t>
+      </w:r>
+    </w:p>
+    <w:p>
+      <w:pPr>
+        <w:spacing w:after="0" w:line="240" w:lineRule="auto"/>
+      </w:pPr>
+      <w:r>
+        <w:t>2. Expandir para seguros, gestoras</w:t>
+      </w:r>
+    </w:p>
+    <w:p>
+      <w:pPr>
+        <w:spacing w:after="0" w:line="240" w:lineRule="auto"/>
+      </w:pPr>
+      <w:r>
+        <w:t>3. Contratar equipe comercial</w:t>
+      </w:r>
+    </w:p>
+    <w:p>
+      <w:pPr>
+        <w:spacing w:after="0" w:line="240" w:lineRule="auto"/>
+      </w:pPr>
+      <w:r>
+        <w:pict w14:anchorId="2AF2A864">
+          <v:rect id="_x0000_i1030" style="width:0;height:.75pt" o:hralign="center" o:hrstd="t" o:hr="t" fillcolor="#a0a0a0" stroked="f"/>
+        </w:pict>
+      </w:r>
+    </w:p>
+    <w:p>
+      <w:pPr>
+        <w:spacing w:after="0" w:line="240" w:lineRule="auto"/>
+        <w:rPr>
+          <w:b/>
+          <w:bCs/>
+        </w:rPr>
+      </w:pPr>
+      <w:r>
+        <w:rPr>
+          <w:rFonts w:ascii="Segoe UI Emoji" w:hAnsi="Segoe UI Emoji" w:cs="Segoe UI Emoji"/>
+          <w:b/>
+          <w:bCs/>
+        </w:rPr>
+        <w:t>💡</w:t>
+      </w:r>
+      <w:r>
+        <w:rPr>
+          <w:b/>
+          <w:bCs/>
+        </w:rPr>
+        <w:t> ARGUMENTOS DE VENDA MATADORES:</w:t>
+      </w:r>
+    </w:p>
+    <w:p>
+      <w:pPr>
+        <w:spacing w:after="0" w:line="240" w:lineRule="auto"/>
+        <w:rPr>
+          <w:b/>
+          <w:bCs/>
+        </w:rPr>
+      </w:pPr>
+      <w:r>
+        <w:rPr>
+          <w:b/>
+          <w:bCs/>
+        </w:rPr>
         <w:lastRenderedPageBreak/>
-        <w:t>→ Ganho compartilhado</w:t>
-      </w:r>
-    </w:p>
-    <w:p>
-      <w:pPr>
-        <w:spacing w:after="0" w:line="240" w:lineRule="auto"/>
-        <w:rPr>
-          <w:b/>
-          <w:bCs/>
-        </w:rPr>
-      </w:pPr>
-      <w:r>
-        <w:rPr>
-          <w:b/>
-          <w:bCs/>
-        </w:rPr>
-        <w:t xml:space="preserve">Estratégia 3: "White </w:t>
-      </w:r>
-      <w:proofErr w:type="spellStart"/>
-      <w:r>
-        <w:rPr>
-          <w:b/>
-          <w:bCs/>
-        </w:rPr>
-        <w:t>Label</w:t>
-      </w:r>
-      <w:proofErr w:type="spellEnd"/>
-      <w:r>
-        <w:rPr>
-          <w:b/>
-          <w:bCs/>
-        </w:rPr>
-        <w:t>"</w:t>
+        <w:t>Para o CEO:</w:t>
       </w:r>
     </w:p>
     <w:p>
@@ -1238,24 +1773,92 @@
         <w:spacing w:after="0" w:line="240" w:lineRule="auto"/>
       </w:pPr>
       <w:r>
-        <w:t>Sua tecnologia, marca deles</w:t>
-      </w:r>
-    </w:p>
-    <w:p>
-      <w:pPr>
-        <w:spacing w:after="0" w:line="240" w:lineRule="auto"/>
-      </w:pPr>
-      <w:r>
-        <w:t>Valor: R$ 5.000-50.000/mês por empresa</w:t>
-      </w:r>
-    </w:p>
-    <w:p>
-      <w:pPr>
-        <w:spacing w:after="0" w:line="240" w:lineRule="auto"/>
-      </w:pPr>
-      <w:r>
-        <w:pict w14:anchorId="2039DAE7">
-          <v:rect id="_x0000_i1082" style="width:0;height:.75pt" o:hralign="center" o:hrstd="t" o:hr="t" fillcolor="#a0a0a0" stroked="f"/>
+        <w:t xml:space="preserve">"Nosso robô aumenta conversão em 300% e reduz </w:t>
+      </w:r>
+      <w:proofErr w:type="spellStart"/>
+      <w:r>
+        <w:t>churn</w:t>
+      </w:r>
+      <w:proofErr w:type="spellEnd"/>
+      <w:r>
+        <w:t xml:space="preserve"> em 40%"</w:t>
+      </w:r>
+    </w:p>
+    <w:p>
+      <w:pPr>
+        <w:spacing w:after="0" w:line="240" w:lineRule="auto"/>
+        <w:rPr>
+          <w:b/>
+          <w:bCs/>
+        </w:rPr>
+      </w:pPr>
+      <w:r>
+        <w:rPr>
+          <w:b/>
+          <w:bCs/>
+        </w:rPr>
+        <w:t>Para o CTO:</w:t>
+      </w:r>
+    </w:p>
+    <w:p>
+      <w:pPr>
+        <w:spacing w:after="0" w:line="240" w:lineRule="auto"/>
+      </w:pPr>
+      <w:proofErr w:type="spellStart"/>
+      <w:r>
+        <w:t>text</w:t>
+      </w:r>
+      <w:proofErr w:type="spellEnd"/>
+    </w:p>
+    <w:p>
+      <w:pPr>
+        <w:spacing w:after="0" w:line="240" w:lineRule="auto"/>
+      </w:pPr>
+      <w:r>
+        <w:t>"API simples, integração em 3 dias, suporte 24/7"</w:t>
+      </w:r>
+    </w:p>
+    <w:p>
+      <w:pPr>
+        <w:spacing w:after="0" w:line="240" w:lineRule="auto"/>
+        <w:rPr>
+          <w:b/>
+          <w:bCs/>
+        </w:rPr>
+      </w:pPr>
+      <w:r>
+        <w:rPr>
+          <w:b/>
+          <w:bCs/>
+        </w:rPr>
+        <w:t>Para o Marketing:</w:t>
+      </w:r>
+    </w:p>
+    <w:p>
+      <w:pPr>
+        <w:spacing w:after="0" w:line="240" w:lineRule="auto"/>
+      </w:pPr>
+      <w:proofErr w:type="spellStart"/>
+      <w:r>
+        <w:t>text</w:t>
+      </w:r>
+      <w:proofErr w:type="spellEnd"/>
+    </w:p>
+    <w:p>
+      <w:pPr>
+        <w:spacing w:after="0" w:line="240" w:lineRule="auto"/>
+      </w:pPr>
+      <w:r>
+        <w:t>"Diferencial competitivo único no mercado"</w:t>
+      </w:r>
+    </w:p>
+    <w:p>
+      <w:pPr>
+        <w:spacing w:after="0" w:line="240" w:lineRule="auto"/>
+      </w:pPr>
+      <w:r>
+        <w:pict w14:anchorId="3A32CBA9">
+          <v:rect id="_x0000_i1031" style="width:0;height:.75pt" o:hralign="center" o:hrstd="t" o:hr="t" fillcolor="#a0a0a0" stroked="f"/>
         </w:pict>
       </w:r>
     </w:p>
@@ -1273,30 +1876,39 @@
           <w:b/>
           <w:bCs/>
         </w:rPr>
-        <w:t>🎯</w:t>
-      </w:r>
-      <w:r>
-        <w:rPr>
-          <w:b/>
-          <w:bCs/>
-        </w:rPr>
-        <w:t> ROBÔS MAIS VENDÁVEIS POR SEGMENTO:</w:t>
-      </w:r>
-    </w:p>
-    <w:p>
-      <w:pPr>
-        <w:spacing w:after="0" w:line="240" w:lineRule="auto"/>
-        <w:rPr>
-          <w:b/>
-          <w:bCs/>
-        </w:rPr>
-      </w:pPr>
-      <w:r>
-        <w:rPr>
-          <w:b/>
-          <w:bCs/>
-        </w:rPr>
-        <w:t>Para Corretoras:</w:t>
+        <w:t>🛠️</w:t>
+      </w:r>
+      <w:r>
+        <w:rPr>
+          <w:b/>
+          <w:bCs/>
+        </w:rPr>
+        <w:t> TECNOLOGIAS RECOMENDADAS:</w:t>
+      </w:r>
+    </w:p>
+    <w:p>
+      <w:pPr>
+        <w:spacing w:after="0" w:line="240" w:lineRule="auto"/>
+        <w:rPr>
+          <w:b/>
+          <w:bCs/>
+        </w:rPr>
+      </w:pPr>
+      <w:proofErr w:type="spellStart"/>
+      <w:r>
+        <w:rPr>
+          <w:b/>
+          <w:bCs/>
+        </w:rPr>
+        <w:t>Backend</w:t>
+      </w:r>
+      <w:proofErr w:type="spellEnd"/>
+      <w:r>
+        <w:rPr>
+          <w:b/>
+          <w:bCs/>
+        </w:rPr>
+        <w:t>:</w:t>
       </w:r>
     </w:p>
     <w:p>
@@ -1314,57 +1926,250 @@
         <w:spacing w:after="0" w:line="240" w:lineRule="auto"/>
       </w:pPr>
       <w:r>
+        <w:t xml:space="preserve">Python + </w:t>
+      </w:r>
+      <w:proofErr w:type="spellStart"/>
+      <w:r>
+        <w:t>FastAPI</w:t>
+      </w:r>
+      <w:proofErr w:type="spellEnd"/>
+      <w:r>
+        <w:t xml:space="preserve"> (rápido desenvolvimento)</w:t>
+      </w:r>
+    </w:p>
+    <w:p>
+      <w:pPr>
+        <w:spacing w:after="0" w:line="240" w:lineRule="auto"/>
+      </w:pPr>
+      <w:r>
+        <w:t>PostgreSQL (dados financeiros)</w:t>
+      </w:r>
+    </w:p>
+    <w:p>
+      <w:pPr>
+        <w:spacing w:after="0" w:line="240" w:lineRule="auto"/>
+      </w:pPr>
+      <w:r>
+        <w:t>Redis (cache de cotações)</w:t>
+      </w:r>
+    </w:p>
+    <w:p>
+      <w:pPr>
+        <w:spacing w:after="0" w:line="240" w:lineRule="auto"/>
+        <w:rPr>
+          <w:b/>
+          <w:bCs/>
+        </w:rPr>
+      </w:pPr>
+      <w:r>
+        <w:rPr>
+          <w:b/>
+          <w:bCs/>
+        </w:rPr>
+        <w:t>APIs Financeiras:</w:t>
+      </w:r>
+    </w:p>
+    <w:p>
+      <w:pPr>
+        <w:spacing w:after="0" w:line="240" w:lineRule="auto"/>
+      </w:pPr>
+      <w:proofErr w:type="spellStart"/>
+      <w:r>
+        <w:t>text</w:t>
+      </w:r>
+      <w:proofErr w:type="spellEnd"/>
+    </w:p>
+    <w:p>
+      <w:pPr>
+        <w:spacing w:after="0" w:line="240" w:lineRule="auto"/>
+      </w:pPr>
+      <w:r>
+        <w:t xml:space="preserve">Yahoo </w:t>
+      </w:r>
+      <w:proofErr w:type="spellStart"/>
+      <w:r>
+        <w:t>Finance</w:t>
+      </w:r>
+      <w:proofErr w:type="spellEnd"/>
+      <w:r>
+        <w:t xml:space="preserve"> API (grátis)</w:t>
+      </w:r>
+    </w:p>
+    <w:p>
+      <w:pPr>
+        <w:spacing w:after="0" w:line="240" w:lineRule="auto"/>
+      </w:pPr>
+      <w:r>
+        <w:t xml:space="preserve">Alpha </w:t>
+      </w:r>
+      <w:proofErr w:type="spellStart"/>
+      <w:r>
+        <w:t>Vantage</w:t>
+      </w:r>
+      <w:proofErr w:type="spellEnd"/>
+      <w:r>
+        <w:t xml:space="preserve"> (premium)</w:t>
+      </w:r>
+    </w:p>
+    <w:p>
+      <w:pPr>
+        <w:spacing w:after="0" w:line="240" w:lineRule="auto"/>
+      </w:pPr>
+      <w:r>
+        <w:t>B3 API (dados brasileiros)</w:t>
+      </w:r>
+    </w:p>
+    <w:p>
+      <w:pPr>
+        <w:spacing w:after="0" w:line="240" w:lineRule="auto"/>
+        <w:rPr>
+          <w:lang w:val="en-US"/>
+        </w:rPr>
+      </w:pPr>
+      <w:proofErr w:type="spellStart"/>
+      <w:r>
+        <w:rPr>
+          <w:lang w:val="en-US"/>
+        </w:rPr>
+        <w:t>CoinGecko</w:t>
+      </w:r>
+      <w:proofErr w:type="spellEnd"/>
+      <w:r>
+        <w:rPr>
+          <w:lang w:val="en-US"/>
+        </w:rPr>
+        <w:t xml:space="preserve"> (</w:t>
+      </w:r>
+      <w:proofErr w:type="spellStart"/>
+      <w:r>
+        <w:rPr>
+          <w:lang w:val="en-US"/>
+        </w:rPr>
+        <w:t>cripto</w:t>
+      </w:r>
+      <w:proofErr w:type="spellEnd"/>
+      <w:r>
+        <w:rPr>
+          <w:lang w:val="en-US"/>
+        </w:rPr>
+        <w:t>)</w:t>
+      </w:r>
+    </w:p>
+    <w:p>
+      <w:pPr>
+        <w:spacing w:after="0" w:line="240" w:lineRule="auto"/>
+        <w:rPr>
+          <w:b/>
+          <w:bCs/>
+          <w:lang w:val="en-US"/>
+        </w:rPr>
+      </w:pPr>
+      <w:r>
+        <w:rPr>
+          <w:b/>
+          <w:bCs/>
+          <w:lang w:val="en-US"/>
+        </w:rPr>
+        <w:t>Frontend:</w:t>
+      </w:r>
+    </w:p>
+    <w:p>
+      <w:pPr>
+        <w:spacing w:after="0" w:line="240" w:lineRule="auto"/>
+        <w:rPr>
+          <w:lang w:val="en-US"/>
+        </w:rPr>
+      </w:pPr>
+      <w:r>
+        <w:rPr>
+          <w:lang w:val="en-US"/>
+        </w:rPr>
+        <w:t>text</w:t>
+      </w:r>
+    </w:p>
+    <w:p>
+      <w:pPr>
+        <w:spacing w:after="0" w:line="240" w:lineRule="auto"/>
+        <w:rPr>
+          <w:lang w:val="en-US"/>
+        </w:rPr>
+      </w:pPr>
+      <w:r>
+        <w:rPr>
+          <w:lang w:val="en-US"/>
+        </w:rPr>
+        <w:t>React + TypeScript</w:t>
+      </w:r>
+    </w:p>
+    <w:p>
+      <w:pPr>
+        <w:spacing w:after="0" w:line="240" w:lineRule="auto"/>
+      </w:pPr>
+      <w:r>
+        <w:t>Chart.js para gráficos</w:t>
+      </w:r>
+    </w:p>
+    <w:p>
+      <w:pPr>
+        <w:spacing w:after="0" w:line="240" w:lineRule="auto"/>
+      </w:pPr>
+      <w:proofErr w:type="spellStart"/>
+      <w:r>
+        <w:t>WebSockets</w:t>
+      </w:r>
+      <w:proofErr w:type="spellEnd"/>
+      <w:r>
+        <w:t xml:space="preserve"> para tempo real</w:t>
+      </w:r>
+    </w:p>
+    <w:p>
+      <w:pPr>
+        <w:spacing w:after="0" w:line="240" w:lineRule="auto"/>
+      </w:pPr>
+      <w:r>
+        <w:pict w14:anchorId="49BBE93C">
+          <v:rect id="_x0000_i1032" style="width:0;height:.75pt" o:hralign="center" o:hrstd="t" o:hr="t" fillcolor="#a0a0a0" stroked="f"/>
+        </w:pict>
+      </w:r>
+    </w:p>
+    <w:p>
+      <w:pPr>
+        <w:spacing w:after="0" w:line="240" w:lineRule="auto"/>
+        <w:rPr>
+          <w:b/>
+          <w:bCs/>
+        </w:rPr>
+      </w:pPr>
+      <w:r>
         <w:rPr>
           <w:rFonts w:ascii="Segoe UI Emoji" w:hAnsi="Segoe UI Emoji" w:cs="Segoe UI Emoji"/>
-        </w:rPr>
-        <w:t>🥇</w:t>
-      </w:r>
-      <w:r>
-        <w:t xml:space="preserve"> #1: Simulador de Investimentos Personalizado</w:t>
-      </w:r>
-    </w:p>
-    <w:p>
-      <w:pPr>
-        <w:spacing w:after="0" w:line="240" w:lineRule="auto"/>
-      </w:pPr>
-      <w:r>
-        <w:rPr>
-          <w:rFonts w:ascii="Segoe UI Emoji" w:hAnsi="Segoe UI Emoji" w:cs="Segoe UI Emoji"/>
-        </w:rPr>
-        <w:t>🥈</w:t>
-      </w:r>
-      <w:r>
-        <w:t xml:space="preserve"> #2: Alertas Inteligentes de Carteira  </w:t>
-      </w:r>
-    </w:p>
-    <w:p>
-      <w:pPr>
-        <w:spacing w:after="0" w:line="240" w:lineRule="auto"/>
-      </w:pPr>
-      <w:r>
-        <w:rPr>
-          <w:rFonts w:ascii="Segoe UI Emoji" w:hAnsi="Segoe UI Emoji" w:cs="Segoe UI Emoji"/>
-        </w:rPr>
-        <w:t>🥉</w:t>
-      </w:r>
-      <w:r>
-        <w:t xml:space="preserve"> #3: Comparador de Taxas</w:t>
-      </w:r>
-    </w:p>
-    <w:p>
-      <w:pPr>
-        <w:spacing w:after="0" w:line="240" w:lineRule="auto"/>
-        <w:rPr>
-          <w:b/>
-          <w:bCs/>
-        </w:rPr>
-      </w:pPr>
-      <w:r>
-        <w:rPr>
-          <w:b/>
-          <w:bCs/>
-        </w:rPr>
-        <w:t>Para Bancos:</w:t>
+          <w:b/>
+          <w:bCs/>
+        </w:rPr>
+        <w:t>🎪</w:t>
+      </w:r>
+      <w:r>
+        <w:rPr>
+          <w:b/>
+          <w:bCs/>
+        </w:rPr>
+        <w:t> ESTRATÉGIA DE ENTRADA NO MERCADO:</w:t>
+      </w:r>
+    </w:p>
+    <w:p>
+      <w:pPr>
+        <w:spacing w:after="0" w:line="240" w:lineRule="auto"/>
+        <w:rPr>
+          <w:b/>
+          <w:bCs/>
+        </w:rPr>
+      </w:pPr>
+      <w:r>
+        <w:rPr>
+          <w:b/>
+          <w:bCs/>
+        </w:rPr>
+        <w:t>Alvos Iniciais (Baixa Resistência):</w:t>
       </w:r>
     </w:p>
     <w:p>
@@ -1382,57 +2187,63 @@
         <w:spacing w:after="0" w:line="240" w:lineRule="auto"/>
       </w:pPr>
       <w:r>
-        <w:rPr>
-          <w:rFonts w:ascii="Segoe UI Emoji" w:hAnsi="Segoe UI Emoji" w:cs="Segoe UI Emoji"/>
-        </w:rPr>
-        <w:t>🥇</w:t>
-      </w:r>
-      <w:r>
-        <w:t xml:space="preserve"> #1: Robô de Educação Financeira Gamificada</w:t>
-      </w:r>
-    </w:p>
-    <w:p>
-      <w:pPr>
-        <w:spacing w:after="0" w:line="240" w:lineRule="auto"/>
-      </w:pPr>
-      <w:r>
-        <w:rPr>
-          <w:rFonts w:ascii="Segoe UI Emoji" w:hAnsi="Segoe UI Emoji" w:cs="Segoe UI Emoji"/>
-        </w:rPr>
-        <w:t>🥈</w:t>
-      </w:r>
-      <w:r>
-        <w:t xml:space="preserve"> #2: Analisador de Perfil Comportamental</w:t>
-      </w:r>
-    </w:p>
-    <w:p>
-      <w:pPr>
-        <w:spacing w:after="0" w:line="240" w:lineRule="auto"/>
-      </w:pPr>
-      <w:r>
-        <w:rPr>
-          <w:rFonts w:ascii="Segoe UI Emoji" w:hAnsi="Segoe UI Emoji" w:cs="Segoe UI Emoji"/>
-        </w:rPr>
-        <w:t>🥉</w:t>
-      </w:r>
-      <w:r>
-        <w:t xml:space="preserve"> #3: Sugestor de Produtos Cruzados</w:t>
-      </w:r>
-    </w:p>
-    <w:p>
-      <w:pPr>
-        <w:spacing w:after="0" w:line="240" w:lineRule="auto"/>
-        <w:rPr>
-          <w:b/>
-          <w:bCs/>
-        </w:rPr>
-      </w:pPr>
-      <w:r>
-        <w:rPr>
-          <w:b/>
-          <w:bCs/>
-        </w:rPr>
-        <w:t>Para Fintechs:</w:t>
+        <w:t>1. Corretoras pequenas/médias</w:t>
+      </w:r>
+    </w:p>
+    <w:p>
+      <w:pPr>
+        <w:spacing w:after="0" w:line="240" w:lineRule="auto"/>
+      </w:pPr>
+      <w:r>
+        <w:t xml:space="preserve">2. Fintechs em crescimento  </w:t>
+      </w:r>
+    </w:p>
+    <w:p>
+      <w:pPr>
+        <w:spacing w:after="0" w:line="240" w:lineRule="auto"/>
+      </w:pPr>
+      <w:r>
+        <w:t xml:space="preserve">3. </w:t>
+      </w:r>
+      <w:proofErr w:type="spellStart"/>
+      <w:r>
+        <w:t>Wealth</w:t>
+      </w:r>
+      <w:proofErr w:type="spellEnd"/>
+      <w:r>
+        <w:t xml:space="preserve"> </w:t>
+      </w:r>
+      <w:proofErr w:type="spellStart"/>
+      <w:r>
+        <w:t>techs</w:t>
+      </w:r>
+      <w:proofErr w:type="spellEnd"/>
+      <w:r>
+        <w:t xml:space="preserve"> startups</w:t>
+      </w:r>
+    </w:p>
+    <w:p>
+      <w:pPr>
+        <w:spacing w:after="0" w:line="240" w:lineRule="auto"/>
+      </w:pPr>
+      <w:r>
+        <w:t>4. Bancos digitais</w:t>
+      </w:r>
+    </w:p>
+    <w:p>
+      <w:pPr>
+        <w:spacing w:after="0" w:line="240" w:lineRule="auto"/>
+        <w:rPr>
+          <w:b/>
+          <w:bCs/>
+        </w:rPr>
+      </w:pPr>
+      <w:r>
+        <w:rPr>
+          <w:b/>
+          <w:bCs/>
+        </w:rPr>
+        <w:t>Proposta Inicial:</w:t>
       </w:r>
     </w:p>
     <w:p>
@@ -1450,802 +2261,6 @@
         <w:spacing w:after="0" w:line="240" w:lineRule="auto"/>
       </w:pPr>
       <w:r>
-        <w:rPr>
-          <w:rFonts w:ascii="Segoe UI Emoji" w:hAnsi="Segoe UI Emoji" w:cs="Segoe UI Emoji"/>
-        </w:rPr>
-        <w:t>🥇</w:t>
-      </w:r>
-      <w:r>
-        <w:t xml:space="preserve"> #1: Comparador de Taxas em Tempo Real</w:t>
-      </w:r>
-    </w:p>
-    <w:p>
-      <w:pPr>
-        <w:spacing w:after="0" w:line="240" w:lineRule="auto"/>
-      </w:pPr>
-      <w:r>
-        <w:rPr>
-          <w:rFonts w:ascii="Segoe UI Emoji" w:hAnsi="Segoe UI Emoji" w:cs="Segoe UI Emoji"/>
-        </w:rPr>
-        <w:t>🥈</w:t>
-      </w:r>
-      <w:r>
-        <w:t xml:space="preserve"> #2: Alertas Inteligentes</w:t>
-      </w:r>
-    </w:p>
-    <w:p>
-      <w:pPr>
-        <w:spacing w:after="0" w:line="240" w:lineRule="auto"/>
-      </w:pPr>
-      <w:r>
-        <w:rPr>
-          <w:rFonts w:ascii="Segoe UI Emoji" w:hAnsi="Segoe UI Emoji" w:cs="Segoe UI Emoji"/>
-        </w:rPr>
-        <w:t>🥉</w:t>
-      </w:r>
-      <w:r>
-        <w:t xml:space="preserve"> #3: Robô de Prevenção de Inadimplência</w:t>
-      </w:r>
-    </w:p>
-    <w:p>
-      <w:pPr>
-        <w:spacing w:after="0" w:line="240" w:lineRule="auto"/>
-      </w:pPr>
-      <w:r>
-        <w:pict w14:anchorId="668F851D">
-          <v:rect id="_x0000_i1083" style="width:0;height:.75pt" o:hralign="center" o:hrstd="t" o:hr="t" fillcolor="#a0a0a0" stroked="f"/>
-        </w:pict>
-      </w:r>
-    </w:p>
-    <w:p>
-      <w:pPr>
-        <w:spacing w:after="0" w:line="240" w:lineRule="auto"/>
-        <w:rPr>
-          <w:b/>
-          <w:bCs/>
-        </w:rPr>
-      </w:pPr>
-      <w:r>
-        <w:rPr>
-          <w:rFonts w:ascii="Segoe UI Emoji" w:hAnsi="Segoe UI Emoji" w:cs="Segoe UI Emoji"/>
-          <w:b/>
-          <w:bCs/>
-        </w:rPr>
-        <w:t>🚀</w:t>
-      </w:r>
-      <w:r>
-        <w:rPr>
-          <w:b/>
-          <w:bCs/>
-        </w:rPr>
-        <w:t> ROADMAP DE VENDAS B2B:</w:t>
-      </w:r>
-    </w:p>
-    <w:p>
-      <w:pPr>
-        <w:spacing w:after="0" w:line="240" w:lineRule="auto"/>
-        <w:rPr>
-          <w:b/>
-          <w:bCs/>
-        </w:rPr>
-      </w:pPr>
-      <w:r>
-        <w:rPr>
-          <w:b/>
-          <w:bCs/>
-        </w:rPr>
-        <w:t>Fase 1 - Validação (30 dias)</w:t>
-      </w:r>
-    </w:p>
-    <w:p>
-      <w:pPr>
-        <w:spacing w:after="0" w:line="240" w:lineRule="auto"/>
-      </w:pPr>
-      <w:proofErr w:type="spellStart"/>
-      <w:r>
-        <w:t>text</w:t>
-      </w:r>
-      <w:proofErr w:type="spellEnd"/>
-    </w:p>
-    <w:p>
-      <w:pPr>
-        <w:spacing w:after="0" w:line="240" w:lineRule="auto"/>
-      </w:pPr>
-      <w:r>
-        <w:t>1. Desenvolver 1 robô completo (Simulador)</w:t>
-      </w:r>
-    </w:p>
-    <w:p>
-      <w:pPr>
-        <w:spacing w:after="0" w:line="240" w:lineRule="auto"/>
-      </w:pPr>
-      <w:r>
-        <w:t>2. Oferecer GRÁTIS para 5 corretoras pequenas</w:t>
-      </w:r>
-    </w:p>
-    <w:p>
-      <w:pPr>
-        <w:spacing w:after="0" w:line="240" w:lineRule="auto"/>
-      </w:pPr>
-      <w:r>
-        <w:t>3. Coletar depoimentos e métricas</w:t>
-      </w:r>
-    </w:p>
-    <w:p>
-      <w:pPr>
-        <w:spacing w:after="0" w:line="240" w:lineRule="auto"/>
-      </w:pPr>
-      <w:r>
-        <w:t>4. Refinar produto</w:t>
-      </w:r>
-    </w:p>
-    <w:p>
-      <w:pPr>
-        <w:spacing w:after="0" w:line="240" w:lineRule="auto"/>
-        <w:rPr>
-          <w:b/>
-          <w:bCs/>
-        </w:rPr>
-      </w:pPr>
-      <w:r>
-        <w:rPr>
-          <w:b/>
-          <w:bCs/>
-        </w:rPr>
-        <w:t>Fase 2 - Tração (90 dias)</w:t>
-      </w:r>
-    </w:p>
-    <w:p>
-      <w:pPr>
-        <w:spacing w:after="0" w:line="240" w:lineRule="auto"/>
-      </w:pPr>
-      <w:proofErr w:type="spellStart"/>
-      <w:r>
-        <w:t>text</w:t>
-      </w:r>
-      <w:proofErr w:type="spellEnd"/>
-    </w:p>
-    <w:p>
-      <w:pPr>
-        <w:spacing w:after="0" w:line="240" w:lineRule="auto"/>
-      </w:pPr>
-      <w:r>
-        <w:t>1. Buscar 10-20 corretoras médias (R$ 1.000-5.000/mês)</w:t>
-      </w:r>
-    </w:p>
-    <w:p>
-      <w:pPr>
-        <w:spacing w:after="0" w:line="240" w:lineRule="auto"/>
-      </w:pPr>
-      <w:r>
-        <w:t>2. Desenvolver 2º robô (Alertas)</w:t>
-      </w:r>
-    </w:p>
-    <w:p>
-      <w:pPr>
-        <w:spacing w:after="0" w:line="240" w:lineRule="auto"/>
-      </w:pPr>
-      <w:r>
-        <w:t xml:space="preserve">3. Criar case </w:t>
-      </w:r>
-      <w:proofErr w:type="spellStart"/>
-      <w:r>
-        <w:t>studies</w:t>
-      </w:r>
-      <w:proofErr w:type="spellEnd"/>
-    </w:p>
-    <w:p>
-      <w:pPr>
-        <w:spacing w:after="0" w:line="240" w:lineRule="auto"/>
-      </w:pPr>
-      <w:r>
-        <w:t>4. Participar de eventos do setor</w:t>
-      </w:r>
-    </w:p>
-    <w:p>
-      <w:pPr>
-        <w:spacing w:after="0" w:line="240" w:lineRule="auto"/>
-        <w:rPr>
-          <w:b/>
-          <w:bCs/>
-        </w:rPr>
-      </w:pPr>
-      <w:r>
-        <w:rPr>
-          <w:b/>
-          <w:bCs/>
-        </w:rPr>
-        <w:t>Fase 3 - Escala (6 meses+)</w:t>
-      </w:r>
-    </w:p>
-    <w:p>
-      <w:pPr>
-        <w:spacing w:after="0" w:line="240" w:lineRule="auto"/>
-      </w:pPr>
-      <w:proofErr w:type="spellStart"/>
-      <w:r>
-        <w:t>text</w:t>
-      </w:r>
-      <w:proofErr w:type="spellEnd"/>
-    </w:p>
-    <w:p>
-      <w:pPr>
-        <w:spacing w:after="0" w:line="240" w:lineRule="auto"/>
-      </w:pPr>
-      <w:r>
-        <w:t>1. Atacar grandes bancos/corretoras (R$ 10.000+/mês)</w:t>
-      </w:r>
-    </w:p>
-    <w:p>
-      <w:pPr>
-        <w:spacing w:after="0" w:line="240" w:lineRule="auto"/>
-      </w:pPr>
-      <w:r>
-        <w:t>2. Expandir para seguros, gestoras</w:t>
-      </w:r>
-    </w:p>
-    <w:p>
-      <w:pPr>
-        <w:spacing w:after="0" w:line="240" w:lineRule="auto"/>
-      </w:pPr>
-      <w:r>
-        <w:t>3. Contratar equipe comercial</w:t>
-      </w:r>
-    </w:p>
-    <w:p>
-      <w:pPr>
-        <w:spacing w:after="0" w:line="240" w:lineRule="auto"/>
-      </w:pPr>
-      <w:r>
-        <w:pict w14:anchorId="2AF2A864">
-          <v:rect id="_x0000_i1084" style="width:0;height:.75pt" o:hralign="center" o:hrstd="t" o:hr="t" fillcolor="#a0a0a0" stroked="f"/>
-        </w:pict>
-      </w:r>
-    </w:p>
-    <w:p>
-      <w:pPr>
-        <w:spacing w:after="0" w:line="240" w:lineRule="auto"/>
-        <w:rPr>
-          <w:b/>
-          <w:bCs/>
-        </w:rPr>
-      </w:pPr>
-      <w:r>
-        <w:rPr>
-          <w:rFonts w:ascii="Segoe UI Emoji" w:hAnsi="Segoe UI Emoji" w:cs="Segoe UI Emoji"/>
-          <w:b/>
-          <w:bCs/>
-        </w:rPr>
-        <w:t>💡</w:t>
-      </w:r>
-      <w:r>
-        <w:rPr>
-          <w:b/>
-          <w:bCs/>
-        </w:rPr>
-        <w:t> ARGUMENTOS DE VENDA MATADORES:</w:t>
-      </w:r>
-    </w:p>
-    <w:p>
-      <w:pPr>
-        <w:spacing w:after="0" w:line="240" w:lineRule="auto"/>
-        <w:rPr>
-          <w:b/>
-          <w:bCs/>
-        </w:rPr>
-      </w:pPr>
-      <w:r>
-        <w:rPr>
-          <w:b/>
-          <w:bCs/>
-        </w:rPr>
-        <w:t>Para o CEO:</w:t>
-      </w:r>
-    </w:p>
-    <w:p>
-      <w:pPr>
-        <w:spacing w:after="0" w:line="240" w:lineRule="auto"/>
-      </w:pPr>
-      <w:proofErr w:type="spellStart"/>
-      <w:r>
-        <w:t>text</w:t>
-      </w:r>
-      <w:proofErr w:type="spellEnd"/>
-    </w:p>
-    <w:p>
-      <w:pPr>
-        <w:spacing w:after="0" w:line="240" w:lineRule="auto"/>
-      </w:pPr>
-      <w:r>
-        <w:t xml:space="preserve">"Nosso robô aumenta conversão em 300% e reduz </w:t>
-      </w:r>
-      <w:proofErr w:type="spellStart"/>
-      <w:r>
-        <w:t>churn</w:t>
-      </w:r>
-      <w:proofErr w:type="spellEnd"/>
-      <w:r>
-        <w:t xml:space="preserve"> em 40%"</w:t>
-      </w:r>
-    </w:p>
-    <w:p>
-      <w:pPr>
-        <w:spacing w:after="0" w:line="240" w:lineRule="auto"/>
-        <w:rPr>
-          <w:b/>
-          <w:bCs/>
-        </w:rPr>
-      </w:pPr>
-      <w:r>
-        <w:rPr>
-          <w:b/>
-          <w:bCs/>
-        </w:rPr>
-        <w:lastRenderedPageBreak/>
-        <w:t>Para o CTO:</w:t>
-      </w:r>
-    </w:p>
-    <w:p>
-      <w:pPr>
-        <w:spacing w:after="0" w:line="240" w:lineRule="auto"/>
-      </w:pPr>
-      <w:proofErr w:type="spellStart"/>
-      <w:r>
-        <w:t>text</w:t>
-      </w:r>
-      <w:proofErr w:type="spellEnd"/>
-    </w:p>
-    <w:p>
-      <w:pPr>
-        <w:spacing w:after="0" w:line="240" w:lineRule="auto"/>
-      </w:pPr>
-      <w:r>
-        <w:t>"API simples, integração em 3 dias, suporte 24/7"</w:t>
-      </w:r>
-    </w:p>
-    <w:p>
-      <w:pPr>
-        <w:spacing w:after="0" w:line="240" w:lineRule="auto"/>
-        <w:rPr>
-          <w:b/>
-          <w:bCs/>
-        </w:rPr>
-      </w:pPr>
-      <w:r>
-        <w:rPr>
-          <w:b/>
-          <w:bCs/>
-        </w:rPr>
-        <w:t>Para o Marketing:</w:t>
-      </w:r>
-    </w:p>
-    <w:p>
-      <w:pPr>
-        <w:spacing w:after="0" w:line="240" w:lineRule="auto"/>
-      </w:pPr>
-      <w:proofErr w:type="spellStart"/>
-      <w:r>
-        <w:t>text</w:t>
-      </w:r>
-      <w:proofErr w:type="spellEnd"/>
-    </w:p>
-    <w:p>
-      <w:pPr>
-        <w:spacing w:after="0" w:line="240" w:lineRule="auto"/>
-      </w:pPr>
-      <w:r>
-        <w:t>"Diferencial competitivo único no mercado"</w:t>
-      </w:r>
-    </w:p>
-    <w:p>
-      <w:pPr>
-        <w:spacing w:after="0" w:line="240" w:lineRule="auto"/>
-      </w:pPr>
-      <w:r>
-        <w:pict w14:anchorId="3A32CBA9">
-          <v:rect id="_x0000_i1085" style="width:0;height:.75pt" o:hralign="center" o:hrstd="t" o:hr="t" fillcolor="#a0a0a0" stroked="f"/>
-        </w:pict>
-      </w:r>
-    </w:p>
-    <w:p>
-      <w:pPr>
-        <w:spacing w:after="0" w:line="240" w:lineRule="auto"/>
-        <w:rPr>
-          <w:b/>
-          <w:bCs/>
-        </w:rPr>
-      </w:pPr>
-      <w:r>
-        <w:rPr>
-          <w:rFonts w:ascii="Segoe UI Emoji" w:hAnsi="Segoe UI Emoji" w:cs="Segoe UI Emoji"/>
-          <w:b/>
-          <w:bCs/>
-        </w:rPr>
-        <w:t>🛠️</w:t>
-      </w:r>
-      <w:r>
-        <w:rPr>
-          <w:b/>
-          <w:bCs/>
-        </w:rPr>
-        <w:t> TECNOLOGIAS RECOMENDADAS:</w:t>
-      </w:r>
-    </w:p>
-    <w:p>
-      <w:pPr>
-        <w:spacing w:after="0" w:line="240" w:lineRule="auto"/>
-        <w:rPr>
-          <w:b/>
-          <w:bCs/>
-        </w:rPr>
-      </w:pPr>
-      <w:proofErr w:type="spellStart"/>
-      <w:r>
-        <w:rPr>
-          <w:b/>
-          <w:bCs/>
-        </w:rPr>
-        <w:t>Backend</w:t>
-      </w:r>
-      <w:proofErr w:type="spellEnd"/>
-      <w:r>
-        <w:rPr>
-          <w:b/>
-          <w:bCs/>
-        </w:rPr>
-        <w:t>:</w:t>
-      </w:r>
-    </w:p>
-    <w:p>
-      <w:pPr>
-        <w:spacing w:after="0" w:line="240" w:lineRule="auto"/>
-      </w:pPr>
-      <w:proofErr w:type="spellStart"/>
-      <w:r>
-        <w:t>text</w:t>
-      </w:r>
-      <w:proofErr w:type="spellEnd"/>
-    </w:p>
-    <w:p>
-      <w:pPr>
-        <w:spacing w:after="0" w:line="240" w:lineRule="auto"/>
-      </w:pPr>
-      <w:r>
-        <w:t xml:space="preserve">Python + </w:t>
-      </w:r>
-      <w:proofErr w:type="spellStart"/>
-      <w:r>
-        <w:t>FastAPI</w:t>
-      </w:r>
-      <w:proofErr w:type="spellEnd"/>
-      <w:r>
-        <w:t xml:space="preserve"> (rápido desenvolvimento)</w:t>
-      </w:r>
-    </w:p>
-    <w:p>
-      <w:pPr>
-        <w:spacing w:after="0" w:line="240" w:lineRule="auto"/>
-      </w:pPr>
-      <w:r>
-        <w:t>PostgreSQL (dados financeiros)</w:t>
-      </w:r>
-    </w:p>
-    <w:p>
-      <w:pPr>
-        <w:spacing w:after="0" w:line="240" w:lineRule="auto"/>
-      </w:pPr>
-      <w:r>
-        <w:t>Redis (cache de cotações)</w:t>
-      </w:r>
-    </w:p>
-    <w:p>
-      <w:pPr>
-        <w:spacing w:after="0" w:line="240" w:lineRule="auto"/>
-        <w:rPr>
-          <w:b/>
-          <w:bCs/>
-        </w:rPr>
-      </w:pPr>
-      <w:r>
-        <w:rPr>
-          <w:b/>
-          <w:bCs/>
-        </w:rPr>
-        <w:t>APIs Financeiras:</w:t>
-      </w:r>
-    </w:p>
-    <w:p>
-      <w:pPr>
-        <w:spacing w:after="0" w:line="240" w:lineRule="auto"/>
-      </w:pPr>
-      <w:proofErr w:type="spellStart"/>
-      <w:r>
-        <w:t>text</w:t>
-      </w:r>
-      <w:proofErr w:type="spellEnd"/>
-    </w:p>
-    <w:p>
-      <w:pPr>
-        <w:spacing w:after="0" w:line="240" w:lineRule="auto"/>
-      </w:pPr>
-      <w:r>
-        <w:t xml:space="preserve">Yahoo </w:t>
-      </w:r>
-      <w:proofErr w:type="spellStart"/>
-      <w:r>
-        <w:t>Finance</w:t>
-      </w:r>
-      <w:proofErr w:type="spellEnd"/>
-      <w:r>
-        <w:t xml:space="preserve"> API (grátis)</w:t>
-      </w:r>
-    </w:p>
-    <w:p>
-      <w:pPr>
-        <w:spacing w:after="0" w:line="240" w:lineRule="auto"/>
-      </w:pPr>
-      <w:r>
-        <w:t xml:space="preserve">Alpha </w:t>
-      </w:r>
-      <w:proofErr w:type="spellStart"/>
-      <w:r>
-        <w:t>Vantage</w:t>
-      </w:r>
-      <w:proofErr w:type="spellEnd"/>
-      <w:r>
-        <w:t xml:space="preserve"> (premium)</w:t>
-      </w:r>
-    </w:p>
-    <w:p>
-      <w:pPr>
-        <w:spacing w:after="0" w:line="240" w:lineRule="auto"/>
-      </w:pPr>
-      <w:r>
-        <w:t>B3 API (dados brasileiros)</w:t>
-      </w:r>
-    </w:p>
-    <w:p>
-      <w:pPr>
-        <w:spacing w:after="0" w:line="240" w:lineRule="auto"/>
-        <w:rPr>
-          <w:lang w:val="en-US"/>
-        </w:rPr>
-      </w:pPr>
-      <w:proofErr w:type="spellStart"/>
-      <w:r>
-        <w:rPr>
-          <w:lang w:val="en-US"/>
-        </w:rPr>
-        <w:t>CoinGecko</w:t>
-      </w:r>
-      <w:proofErr w:type="spellEnd"/>
-      <w:r>
-        <w:rPr>
-          <w:lang w:val="en-US"/>
-        </w:rPr>
-        <w:t xml:space="preserve"> (</w:t>
-      </w:r>
-      <w:proofErr w:type="spellStart"/>
-      <w:r>
-        <w:rPr>
-          <w:lang w:val="en-US"/>
-        </w:rPr>
-        <w:t>cripto</w:t>
-      </w:r>
-      <w:proofErr w:type="spellEnd"/>
-      <w:r>
-        <w:rPr>
-          <w:lang w:val="en-US"/>
-        </w:rPr>
-        <w:t>)</w:t>
-      </w:r>
-    </w:p>
-    <w:p>
-      <w:pPr>
-        <w:spacing w:after="0" w:line="240" w:lineRule="auto"/>
-        <w:rPr>
-          <w:b/>
-          <w:bCs/>
-          <w:lang w:val="en-US"/>
-        </w:rPr>
-      </w:pPr>
-      <w:r>
-        <w:rPr>
-          <w:b/>
-          <w:bCs/>
-          <w:lang w:val="en-US"/>
-        </w:rPr>
-        <w:t>Frontend:</w:t>
-      </w:r>
-    </w:p>
-    <w:p>
-      <w:pPr>
-        <w:spacing w:after="0" w:line="240" w:lineRule="auto"/>
-        <w:rPr>
-          <w:lang w:val="en-US"/>
-        </w:rPr>
-      </w:pPr>
-      <w:r>
-        <w:rPr>
-          <w:lang w:val="en-US"/>
-        </w:rPr>
-        <w:t>text</w:t>
-      </w:r>
-    </w:p>
-    <w:p>
-      <w:pPr>
-        <w:spacing w:after="0" w:line="240" w:lineRule="auto"/>
-        <w:rPr>
-          <w:lang w:val="en-US"/>
-        </w:rPr>
-      </w:pPr>
-      <w:r>
-        <w:rPr>
-          <w:lang w:val="en-US"/>
-        </w:rPr>
-        <w:t>React + TypeScript</w:t>
-      </w:r>
-    </w:p>
-    <w:p>
-      <w:pPr>
-        <w:spacing w:after="0" w:line="240" w:lineRule="auto"/>
-      </w:pPr>
-      <w:r>
-        <w:t>Chart.js para gráficos</w:t>
-      </w:r>
-    </w:p>
-    <w:p>
-      <w:pPr>
-        <w:spacing w:after="0" w:line="240" w:lineRule="auto"/>
-      </w:pPr>
-      <w:proofErr w:type="spellStart"/>
-      <w:r>
-        <w:t>WebSockets</w:t>
-      </w:r>
-      <w:proofErr w:type="spellEnd"/>
-      <w:r>
-        <w:t xml:space="preserve"> para tempo real</w:t>
-      </w:r>
-    </w:p>
-    <w:p>
-      <w:pPr>
-        <w:spacing w:after="0" w:line="240" w:lineRule="auto"/>
-      </w:pPr>
-      <w:r>
-        <w:pict w14:anchorId="49BBE93C">
-          <v:rect id="_x0000_i1086" style="width:0;height:.75pt" o:hralign="center" o:hrstd="t" o:hr="t" fillcolor="#a0a0a0" stroked="f"/>
-        </w:pict>
-      </w:r>
-    </w:p>
-    <w:p>
-      <w:pPr>
-        <w:spacing w:after="0" w:line="240" w:lineRule="auto"/>
-        <w:rPr>
-          <w:b/>
-          <w:bCs/>
-        </w:rPr>
-      </w:pPr>
-      <w:r>
-        <w:rPr>
-          <w:rFonts w:ascii="Segoe UI Emoji" w:hAnsi="Segoe UI Emoji" w:cs="Segoe UI Emoji"/>
-          <w:b/>
-          <w:bCs/>
-        </w:rPr>
-        <w:t>🎪</w:t>
-      </w:r>
-      <w:r>
-        <w:rPr>
-          <w:b/>
-          <w:bCs/>
-        </w:rPr>
-        <w:t> ESTRATÉGIA DE ENTRADA NO MERCADO:</w:t>
-      </w:r>
-    </w:p>
-    <w:p>
-      <w:pPr>
-        <w:spacing w:after="0" w:line="240" w:lineRule="auto"/>
-        <w:rPr>
-          <w:b/>
-          <w:bCs/>
-        </w:rPr>
-      </w:pPr>
-      <w:r>
-        <w:rPr>
-          <w:b/>
-          <w:bCs/>
-        </w:rPr>
-        <w:t>Alvos Iniciais (Baixa Resistência):</w:t>
-      </w:r>
-    </w:p>
-    <w:p>
-      <w:pPr>
-        <w:spacing w:after="0" w:line="240" w:lineRule="auto"/>
-      </w:pPr>
-      <w:proofErr w:type="spellStart"/>
-      <w:r>
-        <w:t>text</w:t>
-      </w:r>
-      <w:proofErr w:type="spellEnd"/>
-    </w:p>
-    <w:p>
-      <w:pPr>
-        <w:spacing w:after="0" w:line="240" w:lineRule="auto"/>
-      </w:pPr>
-      <w:r>
-        <w:t>1. Corretoras pequenas/médias</w:t>
-      </w:r>
-    </w:p>
-    <w:p>
-      <w:pPr>
-        <w:spacing w:after="0" w:line="240" w:lineRule="auto"/>
-      </w:pPr>
-      <w:r>
-        <w:t xml:space="preserve">2. Fintechs em crescimento  </w:t>
-      </w:r>
-    </w:p>
-    <w:p>
-      <w:pPr>
-        <w:spacing w:after="0" w:line="240" w:lineRule="auto"/>
-      </w:pPr>
-      <w:r>
-        <w:t xml:space="preserve">3. </w:t>
-      </w:r>
-      <w:proofErr w:type="spellStart"/>
-      <w:r>
-        <w:t>Wealth</w:t>
-      </w:r>
-      <w:proofErr w:type="spellEnd"/>
-      <w:r>
-        <w:t xml:space="preserve"> </w:t>
-      </w:r>
-      <w:proofErr w:type="spellStart"/>
-      <w:r>
-        <w:t>techs</w:t>
-      </w:r>
-      <w:proofErr w:type="spellEnd"/>
-      <w:r>
-        <w:t xml:space="preserve"> startups</w:t>
-      </w:r>
-    </w:p>
-    <w:p>
-      <w:pPr>
-        <w:spacing w:after="0" w:line="240" w:lineRule="auto"/>
-      </w:pPr>
-      <w:r>
-        <w:t>4. Bancos digitais</w:t>
-      </w:r>
-    </w:p>
-    <w:p>
-      <w:pPr>
-        <w:spacing w:after="0" w:line="240" w:lineRule="auto"/>
-        <w:rPr>
-          <w:b/>
-          <w:bCs/>
-        </w:rPr>
-      </w:pPr>
-      <w:r>
-        <w:rPr>
-          <w:b/>
-          <w:bCs/>
-        </w:rPr>
-        <w:t>Proposta Inicial:</w:t>
-      </w:r>
-    </w:p>
-    <w:p>
-      <w:pPr>
-        <w:spacing w:after="0" w:line="240" w:lineRule="auto"/>
-      </w:pPr>
-      <w:proofErr w:type="spellStart"/>
-      <w:r>
-        <w:t>text</w:t>
-      </w:r>
-      <w:proofErr w:type="spellEnd"/>
-    </w:p>
-    <w:p>
-      <w:pPr>
-        <w:spacing w:after="0" w:line="240" w:lineRule="auto"/>
-      </w:pPr>
-      <w:r>
         <w:t>"Teste 30 dias grátis - se não aumentar suas métricas, cancele"</w:t>
       </w:r>
     </w:p>
@@ -2255,7 +2270,7 @@
       </w:pPr>
       <w:r>
         <w:pict w14:anchorId="48EF90A4">
-          <v:rect id="_x0000_i1087" style="width:0;height:.75pt" o:hralign="center" o:hrstd="t" o:hr="t" fillcolor="#a0a0a0" stroked="f"/>
+          <v:rect id="_x0000_i1033" style="width:0;height:.75pt" o:hralign="center" o:hrstd="t" o:hr="t" fillcolor="#a0a0a0" stroked="f"/>
         </w:pict>
       </w:r>
     </w:p>
@@ -2357,6 +2372,7 @@
         <w:spacing w:after="0" w:line="240" w:lineRule="auto"/>
       </w:pPr>
       <w:r>
+        <w:lastRenderedPageBreak/>
         <w:t>Recomendo começar com o </w:t>
       </w:r>
       <w:r>
@@ -3141,6 +3157,7 @@
   <w:style w:type="character" w:default="1" w:styleId="Fontepargpadro">
     <w:name w:val="Default Paragraph Font"/>
     <w:uiPriority w:val="1"/>
+    <w:semiHidden/>
     <w:unhideWhenUsed/>
   </w:style>
   <w:style w:type="table" w:default="1" w:styleId="Tabelanormal">

</xml_diff>